<commit_message>
Keep a Word file's own look (fonts, sizes, colours, spacing, margins), headings bold by style found, fuller examples (work in progress)
</commit_message>
<xml_diff>
--- a/server/test/fixtures/alex-cv.docx
+++ b/server/test/fixtures/alex-cv.docx
@@ -6,7 +6,8 @@
       <w:r>
         <w:rPr>
           <w:b/>
-          <w:sz w:val="40"/>
+          <w:color w:val="2E5597"/>
+          <w:sz w:val="44"/>
         </w:rPr>
         <w:t xml:space="preserve">Alex Example</w:t>
       </w:r>
@@ -63,10 +64,11 @@
       </w:r>
     </w:p>
     <w:p>
-      <w:r>
-        <w:rPr>
-          <w:b/>
-        </w:rPr>
+      <w:pPr>
+        <w:pStyle w:val="Section"/>
+      </w:pPr>
+      <w:r>
+        <w:rPr/>
         <w:t xml:space="preserve">SKILLS</w:t>
       </w:r>
     </w:p>
@@ -107,10 +109,11 @@
       </w:r>
     </w:p>
     <w:p>
-      <w:r>
-        <w:rPr>
-          <w:b/>
-        </w:rPr>
+      <w:pPr>
+        <w:pStyle w:val="Section"/>
+      </w:pPr>
+      <w:r>
+        <w:rPr/>
         <w:t xml:space="preserve">EXPERIENCE</w:t>
       </w:r>
     </w:p>
@@ -237,10 +240,11 @@
       </w:r>
     </w:p>
     <w:p>
-      <w:r>
-        <w:rPr>
-          <w:b/>
-        </w:rPr>
+      <w:pPr>
+        <w:pStyle w:val="Section"/>
+      </w:pPr>
+      <w:r>
+        <w:rPr/>
         <w:t xml:space="preserve">EDUCATION</w:t>
       </w:r>
     </w:p>
@@ -276,10 +280,11 @@
       </w:tr>
     </w:tbl>
     <w:p>
-      <w:r>
-        <w:rPr>
-          <w:b/>
-        </w:rPr>
+      <w:pPr>
+        <w:pStyle w:val="Section"/>
+      </w:pPr>
+      <w:r>
+        <w:rPr/>
         <w:t xml:space="preserve">LANGUAGES</w:t>
       </w:r>
     </w:p>
@@ -295,6 +300,10 @@
         <w:t xml:space="preserve">German – native</w:t>
       </w:r>
     </w:p>
+    <w:sectPr>
+      <w:pgSz w:w="11906" w:h="16838"/>
+      <w:pgMar w:top="1134" w:right="1134" w:bottom="1134" w:left="1134"/>
+    </w:sectPr>
   </w:body>
 </w:document>
 </file>
@@ -311,4 +320,42 @@
     <w:abstractNumId w:val="0"/>
   </w:num>
 </w:numbering>
+</file>
+
+<file path=word/styles.xml><?xml version="1.0" encoding="utf-8"?>
+<w:styles xmlns:w="http://schemas.openxmlformats.org/wordprocessingml/2006/main" xmlns:r="http://schemas.openxmlformats.org/officeDocument/2006/relationships">
+  <w:docDefaults>
+    <w:rPrDefault>
+      <w:rPr>
+        <w:rFonts w:ascii="Georgia" w:hAnsi="Georgia"/>
+        <w:sz w:val="21"/>
+        <w:color w:val="333333"/>
+      </w:rPr>
+    </w:rPrDefault>
+    <w:pPrDefault>
+      <w:pPr>
+        <w:spacing w:after="80" w:line="264" w:lineRule="auto"/>
+      </w:pPr>
+    </w:pPrDefault>
+  </w:docDefaults>
+  <w:style w:type="paragraph" w:default="1" w:styleId="Normal">
+    <w:name w:val="Normal"/>
+  </w:style>
+  <w:style w:type="paragraph" w:styleId="Section">
+    <w:name w:val="Section"/>
+    <w:basedOn w:val="Normal"/>
+    <w:pPr>
+      <w:pBdr>
+        <w:bottom w:val="single" w:sz="6" w:space="1" w:color="2E5597"/>
+      </w:pBdr>
+      <w:spacing w:before="240"/>
+    </w:pPr>
+    <w:rPr>
+      <w:b/>
+      <w:caps/>
+      <w:color w:val="2E5597"/>
+      <w:sz w:val="24"/>
+    </w:rPr>
+  </w:style>
+</w:styles>
 </file>
</xml_diff>